<commit_message>
Complete M0012 correction 03
</commit_message>
<xml_diff>
--- a/tests/fixtures/m0012/list-prototypes.docx
+++ b/tests/fixtures/m0012/list-prototypes.docx
@@ -123,7 +123,7 @@
 <file path=word/numbering.xml><?xml version="1.0" encoding="utf-8"?>
 <w:numbering xmlns:wpc="http://schemas.microsoft.com/office/word/2010/wordprocessingCanvas" xmlns:cx="http://schemas.microsoft.com/office/drawing/2014/chartex" xmlns:cx1="http://schemas.microsoft.com/office/drawing/2015/9/8/chartex" xmlns:cx2="http://schemas.microsoft.com/office/drawing/2015/10/21/chartex" xmlns:cx3="http://schemas.microsoft.com/office/drawing/2016/5/9/chartex" xmlns:cx4="http://schemas.microsoft.com/office/drawing/2016/5/10/chartex" xmlns:cx5="http://schemas.microsoft.com/office/drawing/2016/5/11/chartex" xmlns:cx6="http://schemas.microsoft.com/office/drawing/2016/5/12/chartex" xmlns:cx7="http://schemas.microsoft.com/office/drawing/2016/5/13/chartex" xmlns:cx8="http://schemas.microsoft.com/office/drawing/2016/5/14/chartex" xmlns:mc="http://schemas.openxmlformats.org/markup-compatibility/2006" xmlns:aink="http://schemas.microsoft.com/office/drawing/2016/ink" xmlns:am3d="http://schemas.microsoft.com/office/drawing/2017/model3d" xmlns:o="urn:schemas-microsoft-com:office:office" xmlns:oel="http://schemas.microsoft.com/office/2019/extlst" xmlns:r="http://schemas.openxmlformats.org/officeDocument/2006/relationships" xmlns:m="http://schemas.openxmlformats.org/officeDocument/2006/math" xmlns:v="urn:schemas-microsoft-com:vml" xmlns:wp14="http://schemas.microsoft.com/office/word/2010/wordprocessingDrawing" xmlns:wp="http://schemas.openxmlformats.org/drawingml/2006/wordprocessingDrawing" xmlns:w10="urn:schemas-microsoft-com:office:word" xmlns:w="http://schemas.openxmlformats.org/wordprocessingml/2006/main" xmlns:w14="http://schemas.microsoft.com/office/word/2010/wordml" xmlns:w15="http://schemas.microsoft.com/office/word/2012/wordml" xmlns:w16cex="http://schemas.microsoft.com/office/word/2018/wordml/cex" xmlns:w16cid="http://schemas.microsoft.com/office/word/2016/wordml/cid" xmlns:w16="http://schemas.microsoft.com/office/word/2018/wordml" xmlns:w16du="http://schemas.microsoft.com/office/word/2023/wordml/word16du" xmlns:w16sdtdh="http://schemas.microsoft.com/office/word/2020/wordml/sdtdatahash" xmlns:w16sdtfl="http://schemas.microsoft.com/office/word/2024/wordml/sdtformatlock" xmlns:w16se="http://schemas.microsoft.com/office/word/2015/wordml/symex" xmlns:wpg="http://schemas.microsoft.com/office/word/2010/wordprocessingGroup" xmlns:wpi="http://schemas.microsoft.com/office/word/2010/wordprocessingInk" xmlns:wne="http://schemas.microsoft.com/office/word/2006/wordml" xmlns:wps="http://schemas.microsoft.com/office/word/2010/wordprocessingShape" mc:Ignorable="w14 w15 w16se w16cid w16 w16cex w16sdtdh w16sdtfl w16du wp14">
   <w:abstractNum w:abstractNumId="0" w15:restartNumberingAfterBreak="0">
-    <w:nsid w:val="226A7CB6"/>
+    <w:nsid w:val="0F67039F"/>
     <w:multiLevelType w:val="singleLevel"/>
     <w:tmpl w:val="20000001"/>
     <w:lvl w:ilvl="0">
@@ -140,7 +140,7 @@
     </w:lvl>
   </w:abstractNum>
   <w:abstractNum w:abstractNumId="1" w15:restartNumberingAfterBreak="0">
-    <w:nsid w:val="6AC968E7"/>
+    <w:nsid w:val="26A36D1C"/>
     <w:multiLevelType w:val="singleLevel"/>
     <w:tmpl w:val="2000000F"/>
     <w:lvl w:ilvl="0">
@@ -153,10 +153,10 @@
       </w:pPr>
     </w:lvl>
   </w:abstractNum>
-  <w:num w:numId="1" w16cid:durableId="656689871">
+  <w:num w:numId="1" w16cid:durableId="81226215">
     <w:abstractNumId w:val="0"/>
   </w:num>
-  <w:num w:numId="2" w16cid:durableId="13649940">
+  <w:num w:numId="2" w16cid:durableId="1120563268">
     <w:abstractNumId w:val="1"/>
   </w:num>
 </w:numbering>
@@ -570,7 +570,7 @@
     <w:link w:val="Heading1Char"/>
     <w:uiPriority w:val="9"/>
     <w:qFormat/>
-    <w:rsid w:val="00DB3BCF"/>
+    <w:rsid w:val="00AD2BD1"/>
     <w:pPr>
       <w:keepNext/>
       <w:keepLines/>
@@ -593,7 +593,7 @@
     <w:semiHidden/>
     <w:unhideWhenUsed/>
     <w:qFormat/>
-    <w:rsid w:val="00DB3BCF"/>
+    <w:rsid w:val="00AD2BD1"/>
     <w:pPr>
       <w:keepNext/>
       <w:keepLines/>
@@ -616,7 +616,7 @@
     <w:semiHidden/>
     <w:unhideWhenUsed/>
     <w:qFormat/>
-    <w:rsid w:val="00DB3BCF"/>
+    <w:rsid w:val="00AD2BD1"/>
     <w:pPr>
       <w:keepNext/>
       <w:keepLines/>
@@ -639,7 +639,7 @@
     <w:semiHidden/>
     <w:unhideWhenUsed/>
     <w:qFormat/>
-    <w:rsid w:val="00DB3BCF"/>
+    <w:rsid w:val="00AD2BD1"/>
     <w:pPr>
       <w:keepNext/>
       <w:keepLines/>
@@ -662,7 +662,7 @@
     <w:semiHidden/>
     <w:unhideWhenUsed/>
     <w:qFormat/>
-    <w:rsid w:val="00DB3BCF"/>
+    <w:rsid w:val="00AD2BD1"/>
     <w:pPr>
       <w:keepNext/>
       <w:keepLines/>
@@ -683,7 +683,7 @@
     <w:semiHidden/>
     <w:unhideWhenUsed/>
     <w:qFormat/>
-    <w:rsid w:val="00DB3BCF"/>
+    <w:rsid w:val="00AD2BD1"/>
     <w:pPr>
       <w:keepNext/>
       <w:keepLines/>
@@ -706,7 +706,7 @@
     <w:semiHidden/>
     <w:unhideWhenUsed/>
     <w:qFormat/>
-    <w:rsid w:val="00DB3BCF"/>
+    <w:rsid w:val="00AD2BD1"/>
     <w:pPr>
       <w:keepNext/>
       <w:keepLines/>
@@ -727,7 +727,7 @@
     <w:semiHidden/>
     <w:unhideWhenUsed/>
     <w:qFormat/>
-    <w:rsid w:val="00DB3BCF"/>
+    <w:rsid w:val="00AD2BD1"/>
     <w:pPr>
       <w:keepNext/>
       <w:keepLines/>
@@ -750,7 +750,7 @@
     <w:semiHidden/>
     <w:unhideWhenUsed/>
     <w:qFormat/>
-    <w:rsid w:val="00DB3BCF"/>
+    <w:rsid w:val="00AD2BD1"/>
     <w:pPr>
       <w:keepNext/>
       <w:keepLines/>
@@ -794,7 +794,7 @@
     <w:basedOn w:val="DefaultParagraphFont"/>
     <w:link w:val="Heading1"/>
     <w:uiPriority w:val="9"/>
-    <w:rsid w:val="00DB3BCF"/>
+    <w:rsid w:val="00AD2BD1"/>
     <w:rPr>
       <w:rFonts w:asciiTheme="majorHAnsi" w:eastAsiaTheme="majorEastAsia" w:hAnsiTheme="majorHAnsi" w:cstheme="majorBidi"/>
       <w:color w:val="0F4761" w:themeColor="accent1" w:themeShade="BF"/>
@@ -808,7 +808,7 @@
     <w:link w:val="Heading2"/>
     <w:uiPriority w:val="9"/>
     <w:semiHidden/>
-    <w:rsid w:val="00DB3BCF"/>
+    <w:rsid w:val="00AD2BD1"/>
     <w:rPr>
       <w:rFonts w:asciiTheme="majorHAnsi" w:eastAsiaTheme="majorEastAsia" w:hAnsiTheme="majorHAnsi" w:cstheme="majorBidi"/>
       <w:color w:val="0F4761" w:themeColor="accent1" w:themeShade="BF"/>
@@ -822,7 +822,7 @@
     <w:link w:val="Heading3"/>
     <w:uiPriority w:val="9"/>
     <w:semiHidden/>
-    <w:rsid w:val="00DB3BCF"/>
+    <w:rsid w:val="00AD2BD1"/>
     <w:rPr>
       <w:rFonts w:eastAsiaTheme="majorEastAsia" w:cstheme="majorBidi"/>
       <w:color w:val="0F4761" w:themeColor="accent1" w:themeShade="BF"/>
@@ -836,7 +836,7 @@
     <w:link w:val="Heading4"/>
     <w:uiPriority w:val="9"/>
     <w:semiHidden/>
-    <w:rsid w:val="00DB3BCF"/>
+    <w:rsid w:val="00AD2BD1"/>
     <w:rPr>
       <w:rFonts w:eastAsiaTheme="majorEastAsia" w:cstheme="majorBidi"/>
       <w:i/>
@@ -850,7 +850,7 @@
     <w:link w:val="Heading5"/>
     <w:uiPriority w:val="9"/>
     <w:semiHidden/>
-    <w:rsid w:val="00DB3BCF"/>
+    <w:rsid w:val="00AD2BD1"/>
     <w:rPr>
       <w:rFonts w:eastAsiaTheme="majorEastAsia" w:cstheme="majorBidi"/>
       <w:color w:val="0F4761" w:themeColor="accent1" w:themeShade="BF"/>
@@ -862,7 +862,7 @@
     <w:link w:val="Heading6"/>
     <w:uiPriority w:val="9"/>
     <w:semiHidden/>
-    <w:rsid w:val="00DB3BCF"/>
+    <w:rsid w:val="00AD2BD1"/>
     <w:rPr>
       <w:rFonts w:eastAsiaTheme="majorEastAsia" w:cstheme="majorBidi"/>
       <w:i/>
@@ -876,7 +876,7 @@
     <w:link w:val="Heading7"/>
     <w:uiPriority w:val="9"/>
     <w:semiHidden/>
-    <w:rsid w:val="00DB3BCF"/>
+    <w:rsid w:val="00AD2BD1"/>
     <w:rPr>
       <w:rFonts w:eastAsiaTheme="majorEastAsia" w:cstheme="majorBidi"/>
       <w:color w:val="595959" w:themeColor="text1" w:themeTint="A6"/>
@@ -888,7 +888,7 @@
     <w:link w:val="Heading8"/>
     <w:uiPriority w:val="9"/>
     <w:semiHidden/>
-    <w:rsid w:val="00DB3BCF"/>
+    <w:rsid w:val="00AD2BD1"/>
     <w:rPr>
       <w:rFonts w:eastAsiaTheme="majorEastAsia" w:cstheme="majorBidi"/>
       <w:i/>
@@ -902,7 +902,7 @@
     <w:link w:val="Heading9"/>
     <w:uiPriority w:val="9"/>
     <w:semiHidden/>
-    <w:rsid w:val="00DB3BCF"/>
+    <w:rsid w:val="00AD2BD1"/>
     <w:rPr>
       <w:rFonts w:eastAsiaTheme="majorEastAsia" w:cstheme="majorBidi"/>
       <w:color w:val="272727" w:themeColor="text1" w:themeTint="D8"/>
@@ -915,7 +915,7 @@
     <w:link w:val="TitleChar"/>
     <w:uiPriority w:val="10"/>
     <w:qFormat/>
-    <w:rsid w:val="00DB3BCF"/>
+    <w:rsid w:val="00AD2BD1"/>
     <w:pPr>
       <w:spacing w:after="80" w:line="240" w:lineRule="auto"/>
       <w:contextualSpacing/>
@@ -933,7 +933,7 @@
     <w:basedOn w:val="DefaultParagraphFont"/>
     <w:link w:val="Title"/>
     <w:uiPriority w:val="10"/>
-    <w:rsid w:val="00DB3BCF"/>
+    <w:rsid w:val="00AD2BD1"/>
     <w:rPr>
       <w:rFonts w:asciiTheme="majorHAnsi" w:eastAsiaTheme="majorEastAsia" w:hAnsiTheme="majorHAnsi" w:cstheme="majorBidi"/>
       <w:spacing w:val="-10"/>
@@ -949,7 +949,7 @@
     <w:link w:val="SubtitleChar"/>
     <w:uiPriority w:val="11"/>
     <w:qFormat/>
-    <w:rsid w:val="00DB3BCF"/>
+    <w:rsid w:val="00AD2BD1"/>
     <w:pPr>
       <w:numPr>
         <w:ilvl w:val="1"/>
@@ -968,7 +968,7 @@
     <w:basedOn w:val="DefaultParagraphFont"/>
     <w:link w:val="Subtitle"/>
     <w:uiPriority w:val="11"/>
-    <w:rsid w:val="00DB3BCF"/>
+    <w:rsid w:val="00AD2BD1"/>
     <w:rPr>
       <w:rFonts w:eastAsiaTheme="majorEastAsia" w:cstheme="majorBidi"/>
       <w:color w:val="595959" w:themeColor="text1" w:themeTint="A6"/>
@@ -984,7 +984,7 @@
     <w:link w:val="QuoteChar"/>
     <w:uiPriority w:val="29"/>
     <w:qFormat/>
-    <w:rsid w:val="00DB3BCF"/>
+    <w:rsid w:val="00AD2BD1"/>
     <w:pPr>
       <w:spacing w:before="160"/>
       <w:jc w:val="center"/>
@@ -1000,7 +1000,7 @@
     <w:basedOn w:val="DefaultParagraphFont"/>
     <w:link w:val="Quote"/>
     <w:uiPriority w:val="29"/>
-    <w:rsid w:val="00DB3BCF"/>
+    <w:rsid w:val="00AD2BD1"/>
     <w:rPr>
       <w:i/>
       <w:iCs/>
@@ -1012,7 +1012,7 @@
     <w:basedOn w:val="Normal"/>
     <w:uiPriority w:val="34"/>
     <w:qFormat/>
-    <w:rsid w:val="00DB3BCF"/>
+    <w:rsid w:val="00AD2BD1"/>
     <w:pPr>
       <w:ind w:left="720"/>
       <w:contextualSpacing/>
@@ -1023,7 +1023,7 @@
     <w:basedOn w:val="DefaultParagraphFont"/>
     <w:uiPriority w:val="21"/>
     <w:qFormat/>
-    <w:rsid w:val="00DB3BCF"/>
+    <w:rsid w:val="00AD2BD1"/>
     <w:rPr>
       <w:i/>
       <w:iCs/>
@@ -1037,7 +1037,7 @@
     <w:link w:val="IntenseQuoteChar"/>
     <w:uiPriority w:val="30"/>
     <w:qFormat/>
-    <w:rsid w:val="00DB3BCF"/>
+    <w:rsid w:val="00AD2BD1"/>
     <w:pPr>
       <w:pBdr>
         <w:top w:val="single" w:sz="4" w:space="10" w:color="0F4761" w:themeColor="accent1" w:themeShade="BF"/>
@@ -1058,7 +1058,7 @@
     <w:basedOn w:val="DefaultParagraphFont"/>
     <w:link w:val="IntenseQuote"/>
     <w:uiPriority w:val="30"/>
-    <w:rsid w:val="00DB3BCF"/>
+    <w:rsid w:val="00AD2BD1"/>
     <w:rPr>
       <w:i/>
       <w:iCs/>
@@ -1070,7 +1070,7 @@
     <w:basedOn w:val="DefaultParagraphFont"/>
     <w:uiPriority w:val="32"/>
     <w:qFormat/>
-    <w:rsid w:val="00DB3BCF"/>
+    <w:rsid w:val="00AD2BD1"/>
     <w:rPr>
       <w:b/>
       <w:bCs/>
@@ -1082,7 +1082,7 @@
   <w:style w:type="character" w:customStyle="1" w:styleId="CodeCharacter">
     <w:name w:val="Code Character"/>
     <w:basedOn w:val="DefaultParagraphFont"/>
-    <w:rsid w:val="00DB3BCF"/>
+    <w:rsid w:val="00AD2BD1"/>
     <w:rPr>
       <w:rFonts w:ascii="Consolas" w:hAnsi="Consolas"/>
       <w:color w:val="A03070"/>

</xml_diff>